<commit_message>
Mémoire : Times New Roman 14 et interligne 1,5 dans tout le document
Listes des tableaux et des figures chacune sur sa page ; sigles, listes,
sommaire, références et annexes en 14 pt à interligne 1,5. Seuls le
contenu des tableaux, les mentions de source et les citations longues
restent plus petits. Rapport resserré pour rester à 10 pages.

Co-Authored-By: Claude Opus 5.5 <noreply@anthropic.com>
Claude-Session: https://claude.ai/code/session_01HxwPseJn9EZbm4HRSeCoVh
</commit_message>
<xml_diff>
--- a/memoire-ngoma/livrables/Liste_de_controle_avant_depot.docx
+++ b/memoire-ngoma/livrables/Liste_de_controle_avant_depot.docx
@@ -228,24 +228,24 @@
           <w:sz w:val="22"/>
           <w:szCs w:val="22"/>
         </w:rPr>
-        <w:t xml:space="preserve">Mise en forme appliquée (Times New Roman 14, interligne 1,5, marges de 2,5 cm et 3 cm à gauche ; annexes, listes et références en 12 pt à interligne simple) : à confronter au document des règles de rédaction de l'ENATSE.</w:t>
-      </w:r>
-    </w:p>
-    <w:p>
-      <w:pPr>
-        <w:pStyle w:val="ListParagraph"/>
-        <w:numPr>
-          <w:ilvl w:val="0"/>
-          <w:numId w:val="1"/>
-        </w:numPr>
-        <w:spacing w:after="80"/>
-      </w:pPr>
-      <w:r>
-        <w:rPr>
-          <w:sz w:val="22"/>
-          <w:szCs w:val="22"/>
-        </w:rPr>
-        <w:t xml:space="preserve">Limite de 70 pages : le mémoire en compte 70, de la page de garde à l'abstract, annexes comprises, mesurées avec l'interligne 1,5 réel. Pour y tenir, 31 paragraphes des chapitres 1 à 4 du protocole ne sont pas repris (liste CONDENSATION dans faire-memoire.mjs), les méthodes telles que conduites (§ 4.2.5 à 4.2.7) sont résumées et le tableau de cohérence (annexe 8 du protocole) n'est pas reproduit : à valider avec la direction de mémoire.</w:t>
+        <w:t xml:space="preserve">Mise en forme appliquée à tout le document (Times New Roman 14, interligne 1,5, marges de 2,5 cm et 3 cm à gauche), pages liminaires, listes des tableaux et des figures (chacune sur sa page), références et annexes comprises ; seuls le contenu des tableaux (11 pt, interligne simple), les mentions de source (11 pt) et les citations longues en retrait (12 pt, interligne simple) font exception : à confronter au document des règles de rédaction de l'ENATSE.</w:t>
+      </w:r>
+    </w:p>
+    <w:p>
+      <w:pPr>
+        <w:pStyle w:val="ListParagraph"/>
+        <w:numPr>
+          <w:ilvl w:val="0"/>
+          <w:numId w:val="1"/>
+        </w:numPr>
+        <w:spacing w:after="80"/>
+      </w:pPr>
+      <w:r>
+        <w:rPr>
+          <w:sz w:val="22"/>
+          <w:szCs w:val="22"/>
+        </w:rPr>
+        <w:t xml:space="preserve">Limite de 70 pages : le corps du mémoire (de l'introduction à la conclusion) compte 45 pages ; le document entier, de la page de garde à l'abstract, en compte 85 depuis que les références et les annexes sont en 14 pt à interligne 1,5. Vérifier si la limite de l'ENATSE porte sur le corps du texte ou sur le document entier. Pour tenir le corps court, 31 paragraphes des chapitres 1 à 4 du protocole ne sont pas repris (liste CONDENSATION dans faire-memoire.mjs), les méthodes telles que conduites (§ 4.2.5 à 4.2.7) sont résumées et le tableau de cohérence (annexe 8 du protocole) n'est pas reproduit : à valider avec la direction de mémoire.</w:t>
       </w:r>
     </w:p>
     <w:p>
@@ -848,12 +848,13 @@
     <w:next w:val="Compact"/>
     <w:qFormat/>
     <w:pPr>
-      <w:spacing w:after="80" w:line="240" w:lineRule="auto"/>
+      <w:spacing w:after="80" w:line="360" w:lineRule="auto"/>
+      <w:jc w:val="left"/>
     </w:pPr>
     <w:rPr>
       <w:rFonts w:ascii="Times New Roman" w:cs="Times New Roman" w:eastAsia="Times New Roman" w:hAnsi="Times New Roman"/>
-      <w:sz w:val="22"/>
-      <w:szCs w:val="22"/>
+      <w:sz w:val="28"/>
+      <w:szCs w:val="28"/>
     </w:rPr>
   </w:style>
   <w:style w:type="paragraph" w:styleId="CompactTitre">
@@ -877,14 +878,14 @@
     <w:next w:val="Bibliographie"/>
     <w:qFormat/>
     <w:pPr>
-      <w:spacing w:after="20" w:line="240" w:lineRule="auto"/>
+      <w:spacing w:after="60" w:line="360" w:lineRule="auto"/>
       <w:ind w:left="567" w:hanging="567"/>
       <w:jc w:val="left"/>
     </w:pPr>
     <w:rPr>
       <w:rFonts w:ascii="Times New Roman" w:cs="Times New Roman" w:eastAsia="Times New Roman" w:hAnsi="Times New Roman"/>
-      <w:sz w:val="24"/>
-      <w:szCs w:val="24"/>
+      <w:sz w:val="28"/>
+      <w:szCs w:val="28"/>
     </w:rPr>
   </w:style>
   <w:style w:type="paragraph" w:styleId="TOC1">
@@ -892,14 +893,14 @@
     <w:basedOn w:val="Normal"/>
     <w:next w:val="Normal"/>
     <w:pPr>
-      <w:spacing w:after="0" w:line="240" w:lineRule="auto"/>
+      <w:spacing w:after="0" w:line="360" w:lineRule="auto"/>
       <w:ind w:left="0"/>
       <w:jc w:val="left"/>
     </w:pPr>
     <w:rPr>
       <w:rFonts w:ascii="Times New Roman" w:cs="Times New Roman" w:eastAsia="Times New Roman" w:hAnsi="Times New Roman"/>
-      <w:sz w:val="24"/>
-      <w:szCs w:val="24"/>
+      <w:sz w:val="28"/>
+      <w:szCs w:val="28"/>
     </w:rPr>
   </w:style>
   <w:style w:type="paragraph" w:styleId="TOC2">
@@ -907,14 +908,14 @@
     <w:basedOn w:val="Normal"/>
     <w:next w:val="Normal"/>
     <w:pPr>
-      <w:spacing w:after="0" w:line="240" w:lineRule="auto"/>
+      <w:spacing w:after="0" w:line="360" w:lineRule="auto"/>
       <w:ind w:left="240"/>
       <w:jc w:val="left"/>
     </w:pPr>
     <w:rPr>
       <w:rFonts w:ascii="Times New Roman" w:cs="Times New Roman" w:eastAsia="Times New Roman" w:hAnsi="Times New Roman"/>
-      <w:sz w:val="24"/>
-      <w:szCs w:val="24"/>
+      <w:sz w:val="28"/>
+      <w:szCs w:val="28"/>
     </w:rPr>
   </w:style>
   <w:style w:type="paragraph" w:styleId="TOC3">
@@ -922,14 +923,14 @@
     <w:basedOn w:val="Normal"/>
     <w:next w:val="Normal"/>
     <w:pPr>
-      <w:spacing w:after="0" w:line="240" w:lineRule="auto"/>
+      <w:spacing w:after="0" w:line="360" w:lineRule="auto"/>
       <w:ind w:left="480"/>
       <w:jc w:val="left"/>
     </w:pPr>
     <w:rPr>
       <w:rFonts w:ascii="Times New Roman" w:cs="Times New Roman" w:eastAsia="Times New Roman" w:hAnsi="Times New Roman"/>
-      <w:sz w:val="24"/>
-      <w:szCs w:val="24"/>
+      <w:sz w:val="28"/>
+      <w:szCs w:val="28"/>
     </w:rPr>
   </w:style>
 </w:styles>

</xml_diff>

<commit_message>
Mémoire : les seize centres de santé nommés au § 4.1.2 ; consentement et guide adaptés
Co-Authored-By: Claude Opus 5.5 <noreply@anthropic.com>
Claude-Session: https://claude.ai/code/session_01HxwPseJn9EZbm4HRSeCoVh
</commit_message>
<xml_diff>
--- a/memoire-ngoma/livrables/Liste_de_controle_avant_depot.docx
+++ b/memoire-ngoma/livrables/Liste_de_controle_avant_depot.docx
@@ -212,6 +212,23 @@
           <w:szCs w:val="22"/>
         </w:rPr>
         <w:t xml:space="preserve">Périmètre de la CPN : la phrase du protocole « la consultation prénatale n'est assurée qu'au niveau des centres de santé ; les postes de santé n'en dispensent pas et l'hôpital n'organise pas de service prénatal [21] » n'a pu être confirmée par aucune source ; la référence [21] (page « Overview » du site de l'hôpital de Kibungo) était inaccessible le 3 octobre 2026. Le mémoire écrit désormais, d'après Mulungi et al. (2023, texte intégral vérifié dans PubMed), que la CPN de base est offerte dans les centres et les postes de santé, et que l'étude porte sur les centres de santé. Corriger le protocole dans le même sens ; vérifier aussi, sur la page de l'hôpital ou auprès du district, la capacité de 312 lits citée au § 4.1.2 avec la même référence [21].</w:t>
+      </w:r>
+    </w:p>
+    <w:p>
+      <w:pPr>
+        <w:pStyle w:val="ListParagraph"/>
+        <w:numPr>
+          <w:ilvl w:val="0"/>
+          <w:numId w:val="1"/>
+        </w:numPr>
+        <w:spacing w:after="80"/>
+      </w:pPr>
+      <w:r>
+        <w:rPr>
+          <w:sz w:val="22"/>
+          <w:szCs w:val="22"/>
+        </w:rPr>
+        <w:t xml:space="preserve">Centres nommés dans le mémoire (décision de l'auteur du 3 octobre 2026) : le § 4.1.2 nomme les seize centres de santé du district (Gasetsa, Gashanda, Giraneza, Jarama, Karembo, Kazo, Kibungo, Kigina, Kirwa, Mutenderi, Nkanga, Nyange, Remera, Rubona, Rukira, Zaza), liste fournie par l'auteur (Gashanda : ancien poste devenu centre de santé, selon l'auteur), sans qu'aucun résultat, citation ou code y soit rattaché. Reporter dans le protocole : § 4.1.2 (liste des centres) ; annexe 1, introduction de l'entretien (« votre nom ne figurera dans aucun de mes documents, et aucun de vos propos ne sera rattaché au nom de votre centre ») ; annexe 4, point 6 (le mémoire nomme les centres, sans y rattacher de résultat). Faire valider ces modifications par la direction de mémoire et le comité d'éthique avant la collecte, et confirmer la liste par écrit auprès de la Direction de la santé du district.</w:t>
       </w:r>
     </w:p>
     <w:p>

</xml_diff>

<commit_message>
Mémoire : liste du personnel de l'ENATSE sur une page (72 pages)
La liste nominative transmise par l'auteur reste hors dépôt
(personnel.json, ignoré) ; le mémoire la met en tableau serré
(11 pt, interligne simple, sans espacement de cellule).

Co-Authored-By: Claude Opus 5.5 <noreply@anthropic.com>
Claude-Session: https://claude.ai/code/session_01HxwPseJn9EZbm4HRSeCoVh
</commit_message>
<xml_diff>
--- a/memoire-ngoma/livrables/Liste_de_controle_avant_depot.docx
+++ b/memoire-ngoma/livrables/Liste_de_controle_avant_depot.docx
@@ -49,23 +49,6 @@
           <w:sz w:val="22"/>
           <w:szCs w:val="22"/>
         </w:rPr>
-        <w:t xml:space="preserve">Liste du personnel de l'École : à recopier depuis la liste officielle de l'ENATSE de l'année du dépôt.</w:t>
-      </w:r>
-    </w:p>
-    <w:p>
-      <w:pPr>
-        <w:pStyle w:val="ListParagraph"/>
-        <w:numPr>
-          <w:ilvl w:val="0"/>
-          <w:numId w:val="1"/>
-        </w:numPr>
-        <w:spacing w:after="80"/>
-      </w:pPr>
-      <w:r>
-        <w:rPr>
-          <w:sz w:val="22"/>
-          <w:szCs w:val="22"/>
-        </w:rPr>
         <w:t xml:space="preserve">Dédicace et remerciements personnels : rédigés selon vos choix du 7 octobre 2026, sans aucun nom propre ; à relire, et à compléter si vous souhaitez nommer votre épouse, vos enfants, vos parents ou d'autres proches (père décédé, mère en vie : précisé par l'auteur le 7 octobre 2026). Hommages aux membres du jury : à écrire après sa désignation, les noms n'étant connus qu'à ce moment.</w:t>
       </w:r>
     </w:p>
@@ -144,6 +127,23 @@
       </w:pPr>
       <w:r>
         <w:t xml:space="preserve">Ce qui reste à vérifier</w:t>
+      </w:r>
+    </w:p>
+    <w:p>
+      <w:pPr>
+        <w:pStyle w:val="ListParagraph"/>
+        <w:numPr>
+          <w:ilvl w:val="0"/>
+          <w:numId w:val="1"/>
+        </w:numPr>
+        <w:spacing w:after="80"/>
+      </w:pPr>
+      <w:r>
+        <w:rPr>
+          <w:sz w:val="22"/>
+          <w:szCs w:val="22"/>
+        </w:rPr>
+        <w:t xml:space="preserve">Liste du personnel de l'École : reprise de la liste officielle du Master transmise par l'auteur (année académique 2024-2025), sur une page, en tableau (11 pt, interligne simple) ; l'intitulé complet de l'École figure sur la page de garde. Vérifier qu'elle est à jour pour l'année du dépôt. Écart à signaler : cette liste indique « Directrice adjointe : Pr Fanny HOUNKPONOU AHOUINGNAN », alors que la page de garde et l'hommage, repris du protocole, la présentent comme « Directrice de l'ENATSE-UP » ; à corriger dans un sens ou dans l'autre selon sa fonction réelle.</w:t>
       </w:r>
     </w:p>
     <w:p>

</xml_diff>